<commit_message>
Remove bookmarks, compress Conclusion and bullets, fix hidden section break to fit 6 pages
</commit_message>
<xml_diff>
--- a/Chakravyuh.docx
+++ b/Chakravyuh.docx
@@ -1708,8 +1708,6 @@
         <w:ind w:left="309" w:right="0" w:hanging="309"/>
         <w:jc w:val="left"/>
       </w:pPr>
-      <w:bookmarkStart w:name="1. Problem &amp; Motivation" w:id="1"/>
-      <w:bookmarkEnd w:id="1"/>
       <w:r>
         <w:rPr>
           <w:b w:val="0"/>
@@ -2637,7 +2635,7 @@
         <w:sectPr>
           <w:type w:val="continuous"/>
           <w:pgSz w:w="12240" w:h="15840"/>
-          <w:pgMar w:top="800" w:bottom="280" w:left="1440" w:right="1080"/>
+          <w:pgMar w:top="1080" w:bottom="1080" w:left="1080" w:right="1080"/>
         </w:sectPr>
       </w:pPr>
     </w:p>
@@ -4547,8 +4545,6 @@
         <w:ind w:left="309" w:right="0" w:hanging="309"/>
         <w:jc w:val="left"/>
       </w:pPr>
-      <w:bookmarkStart w:name="3. Identify: Attack Intelligence Layer" w:id="2"/>
-      <w:bookmarkEnd w:id="2"/>
       <w:r>
         <w:rPr>
           <w:b w:val="0"/>
@@ -7781,7 +7777,7 @@
         </w:rPr>
         <w:sectPr>
           <w:pgSz w:w="12240" w:h="15840"/>
-          <w:pgMar w:top="1360" w:bottom="1379" w:left="1440" w:right="1080"/>
+          <w:pgMar w:top="1080" w:bottom="1080" w:left="1080" w:right="1080"/>
         </w:sectPr>
       </w:pPr>
     </w:p>
@@ -10350,475 +10346,403 @@
         <w:rPr>
           <w:sz w:val="16"/>
         </w:rPr>
-        <w:t>Nine</w:t>
+        <w:t>Conventional models assume the attacker is not the customer. In a scam-induced payment, everything is genuine except the intent, and no standard column captures that. Backed by the measured gap between Logistic Regression and tree models (Section 5).</w:t>
       </w:r>
       <w:r>
         <w:rPr>
           <w:spacing w:val="-4"/>
           <w:sz w:val="16"/>
         </w:rPr>
-        <w:t> </w:t>
-      </w:r>
-      <w:r>
-        <w:rPr>
-          <w:sz w:val="16"/>
-        </w:rPr>
-        <w:t>families</w:t>
-      </w:r>
-      <w:r>
-        <w:rPr>
-          <w:spacing w:val="-2"/>
-          <w:sz w:val="16"/>
-        </w:rPr>
-        <w:t> </w:t>
-      </w:r>
-      <w:r>
-        <w:rPr>
-          <w:sz w:val="16"/>
-        </w:rPr>
-        <w:t>are</w:t>
+      </w:r>
+      <w:r>
+        <w:rPr>
+          <w:sz w:val="16"/>
+        </w:rPr>
+      </w:r>
+      <w:r>
+        <w:rPr>
+          <w:spacing w:val="-2"/>
+          <w:sz w:val="16"/>
+        </w:rPr>
+      </w:r>
+      <w:r>
+        <w:rPr>
+          <w:sz w:val="16"/>
+        </w:rPr>
       </w:r>
       <w:r>
         <w:rPr>
           <w:spacing w:val="-4"/>
           <w:sz w:val="16"/>
         </w:rPr>
-        <w:t> </w:t>
-      </w:r>
-      <w:r>
-        <w:rPr>
-          <w:sz w:val="16"/>
-        </w:rPr>
-        <w:t>explicitly</w:t>
+      </w:r>
+      <w:r>
+        <w:rPr>
+          <w:sz w:val="16"/>
+        </w:rPr>
       </w:r>
       <w:r>
         <w:rPr>
           <w:spacing w:val="-1"/>
           <w:sz w:val="16"/>
         </w:rPr>
-        <w:t> </w:t>
-      </w:r>
-      <w:r>
-        <w:rPr>
-          <w:sz w:val="16"/>
-        </w:rPr>
-        <w:t>designed</w:t>
+      </w:r>
+      <w:r>
+        <w:rPr>
+          <w:sz w:val="16"/>
+        </w:rPr>
       </w:r>
       <w:r>
         <w:rPr>
           <w:spacing w:val="-1"/>
           <w:sz w:val="16"/>
         </w:rPr>
-        <w:t> </w:t>
-      </w:r>
-      <w:r>
-        <w:rPr>
-          <w:sz w:val="16"/>
-        </w:rPr>
-        <w:t>to</w:t>
+      </w:r>
+      <w:r>
+        <w:rPr>
+          <w:sz w:val="16"/>
+        </w:rPr>
       </w:r>
       <w:r>
         <w:rPr>
           <w:spacing w:val="-3"/>
           <w:sz w:val="16"/>
         </w:rPr>
-        <w:t> </w:t>
-      </w:r>
-      <w:r>
-        <w:rPr>
-          <w:sz w:val="16"/>
-        </w:rPr>
-        <w:t>keep</w:t>
+      </w:r>
+      <w:r>
+        <w:rPr>
+          <w:sz w:val="16"/>
+        </w:rPr>
       </w:r>
       <w:r>
         <w:rPr>
           <w:spacing w:val="-1"/>
           <w:sz w:val="16"/>
         </w:rPr>
-        <w:t> </w:t>
-      </w:r>
-      <w:r>
-        <w:rPr>
-          <w:sz w:val="16"/>
-        </w:rPr>
-        <w:t>every</w:t>
+      </w:r>
+      <w:r>
+        <w:rPr>
+          <w:sz w:val="16"/>
+        </w:rPr>
       </w:r>
       <w:r>
         <w:rPr>
           <w:spacing w:val="-1"/>
           <w:sz w:val="16"/>
         </w:rPr>
-        <w:t> </w:t>
-      </w:r>
-      <w:r>
-        <w:rPr>
-          <w:sz w:val="16"/>
-        </w:rPr>
-        <w:t>conventional</w:t>
+      </w:r>
+      <w:r>
+        <w:rPr>
+          <w:sz w:val="16"/>
+        </w:rPr>
       </w:r>
       <w:r>
         <w:rPr>
           <w:spacing w:val="-4"/>
           <w:sz w:val="16"/>
         </w:rPr>
-        <w:t> </w:t>
-      </w:r>
-      <w:r>
-        <w:rPr>
-          <w:sz w:val="16"/>
-        </w:rPr>
-        <w:t>signal,</w:t>
+      </w:r>
+      <w:r>
+        <w:rPr>
+          <w:sz w:val="16"/>
+        </w:rPr>
       </w:r>
       <w:r>
         <w:rPr>
           <w:spacing w:val="-1"/>
           <w:sz w:val="16"/>
         </w:rPr>
-        <w:t> </w:t>
-      </w:r>
-      <w:r>
-        <w:rPr>
-          <w:sz w:val="16"/>
-        </w:rPr>
-        <w:t>including</w:t>
-      </w:r>
-      <w:r>
-        <w:rPr>
-          <w:spacing w:val="-2"/>
-          <w:sz w:val="16"/>
-        </w:rPr>
-        <w:t> </w:t>
-      </w:r>
-      <w:r>
-        <w:rPr>
-          <w:sz w:val="16"/>
-        </w:rPr>
-        <w:t>velocity,</w:t>
+      </w:r>
+      <w:r>
+        <w:rPr>
+          <w:sz w:val="16"/>
+        </w:rPr>
+      </w:r>
+      <w:r>
+        <w:rPr>
+          <w:spacing w:val="-2"/>
+          <w:sz w:val="16"/>
+        </w:rPr>
+      </w:r>
+      <w:r>
+        <w:rPr>
+          <w:sz w:val="16"/>
+        </w:rPr>
       </w:r>
       <w:r>
         <w:rPr>
           <w:spacing w:val="-5"/>
           <w:sz w:val="16"/>
         </w:rPr>
-        <w:t> </w:t>
-      </w:r>
-      <w:r>
-        <w:rPr>
-          <w:sz w:val="16"/>
-        </w:rPr>
-        <w:t>new</w:t>
+      </w:r>
+      <w:r>
+        <w:rPr>
+          <w:sz w:val="16"/>
+        </w:rPr>
       </w:r>
       <w:r>
         <w:rPr>
           <w:spacing w:val="-1"/>
           <w:sz w:val="16"/>
         </w:rPr>
-        <w:t> </w:t>
-      </w:r>
-      <w:r>
-        <w:rPr>
-          <w:sz w:val="16"/>
-        </w:rPr>
-        <w:t>beneficiary,</w:t>
+      </w:r>
+      <w:r>
+        <w:rPr>
+          <w:sz w:val="16"/>
+        </w:rPr>
       </w:r>
       <w:r>
         <w:rPr>
           <w:spacing w:val="-5"/>
           <w:sz w:val="16"/>
         </w:rPr>
-        <w:t> </w:t>
-      </w:r>
-      <w:r>
-        <w:rPr>
-          <w:sz w:val="16"/>
-        </w:rPr>
-        <w:t>amount,</w:t>
+      </w:r>
+      <w:r>
+        <w:rPr>
+          <w:sz w:val="16"/>
+        </w:rPr>
       </w:r>
       <w:r>
         <w:rPr>
           <w:spacing w:val="-1"/>
           <w:sz w:val="16"/>
         </w:rPr>
-        <w:t> </w:t>
-      </w:r>
-      <w:r>
-        <w:rPr>
-          <w:sz w:val="16"/>
-        </w:rPr>
-        <w:t>geo,</w:t>
+      </w:r>
+      <w:r>
+        <w:rPr>
+          <w:sz w:val="16"/>
+        </w:rPr>
       </w:r>
       <w:r>
         <w:rPr>
           <w:spacing w:val="-1"/>
           <w:sz w:val="16"/>
         </w:rPr>
-        <w:t> </w:t>
-      </w:r>
-      <w:r>
-        <w:rPr>
-          <w:sz w:val="16"/>
-        </w:rPr>
-        <w:t>device, and time-of-day, looking normal. These include adversarial_evasion (features optimised inside the legitimate distribution), mule_network (only graph topology exposes it),</w:t>
-      </w:r>
-      <w:r>
-        <w:rPr>
-          <w:spacing w:val="-2"/>
-          <w:sz w:val="16"/>
-        </w:rPr>
-        <w:t> </w:t>
-      </w:r>
-      <w:r>
-        <w:rPr>
-          <w:sz w:val="16"/>
-        </w:rPr>
-        <w:t>stealth_mandate</w:t>
+      </w:r>
+      <w:r>
+        <w:rPr>
+          <w:sz w:val="16"/>
+        </w:rPr>
+      </w:r>
+      <w:r>
+        <w:rPr>
+          <w:spacing w:val="-2"/>
+          <w:sz w:val="16"/>
+        </w:rPr>
+      </w:r>
+      <w:r>
+        <w:rPr>
+          <w:sz w:val="16"/>
+        </w:rPr>
       </w:r>
       <w:r>
         <w:rPr>
           <w:spacing w:val="-1"/>
           <w:sz w:val="16"/>
         </w:rPr>
-        <w:t> </w:t>
-      </w:r>
-      <w:r>
-        <w:rPr>
-          <w:sz w:val="16"/>
-        </w:rPr>
-        <w:t>(amounts</w:t>
+      </w:r>
+      <w:r>
+        <w:rPr>
+          <w:sz w:val="16"/>
+        </w:rPr>
       </w:r>
       <w:r>
         <w:rPr>
           <w:spacing w:val="-4"/>
           <w:sz w:val="16"/>
         </w:rPr>
-        <w:t> </w:t>
-      </w:r>
-      <w:r>
-        <w:rPr>
-          <w:sz w:val="16"/>
-        </w:rPr>
-        <w:t>below every threshold), subthreshold_fragmentation, first_party_dispute (genuine at transaction time), scam_induced_push (own device and PIN, with only session fields carrying the signal), synthetic_identity_bustout</w:t>
+      </w:r>
+      <w:r>
+        <w:rPr>
+          <w:sz w:val="16"/>
+        </w:rPr>
       </w:r>
       <w:r>
         <w:rPr>
           <w:spacing w:val="-1"/>
           <w:sz w:val="16"/>
         </w:rPr>
-        <w:t> </w:t>
-      </w:r>
-      <w:r>
-        <w:rPr>
-          <w:sz w:val="16"/>
-        </w:rPr>
-        <w:t>(the bust-out is</w:t>
-      </w:r>
-      <w:r>
-        <w:rPr>
-          <w:spacing w:val="-2"/>
-          <w:sz w:val="16"/>
-        </w:rPr>
-        <w:t> </w:t>
-      </w:r>
-      <w:r>
-        <w:rPr>
-          <w:sz w:val="16"/>
-        </w:rPr>
-        <w:t>a temporal shift rather than a</w:t>
-      </w:r>
-      <w:r>
-        <w:rPr>
-          <w:spacing w:val="-2"/>
-          <w:sz w:val="16"/>
-        </w:rPr>
-        <w:t> </w:t>
-      </w:r>
-      <w:r>
-        <w:rPr>
-          <w:sz w:val="16"/>
-        </w:rPr>
-        <w:t>feature anomaly),</w:t>
-      </w:r>
-      <w:r>
-        <w:rPr>
-          <w:spacing w:val="-2"/>
-          <w:sz w:val="16"/>
-        </w:rPr>
-        <w:t> </w:t>
-      </w:r>
-      <w:r>
-        <w:rPr>
-          <w:sz w:val="16"/>
-        </w:rPr>
-        <w:t>transaction_laundering (real storefront with a valid-looking MCC), and insider_abuse (no</w:t>
+      </w:r>
+      <w:r>
+        <w:rPr>
+          <w:sz w:val="16"/>
+        </w:rPr>
+      </w:r>
+      <w:r>
+        <w:rPr>
+          <w:spacing w:val="-2"/>
+          <w:sz w:val="16"/>
+        </w:rPr>
+      </w:r>
+      <w:r>
+        <w:rPr>
+          <w:sz w:val="16"/>
+        </w:rPr>
+      </w:r>
+      <w:r>
+        <w:rPr>
+          <w:spacing w:val="-2"/>
+          <w:sz w:val="16"/>
+        </w:rPr>
+      </w:r>
+      <w:r>
+        <w:rPr>
+          <w:sz w:val="16"/>
+        </w:rPr>
+      </w:r>
+      <w:r>
+        <w:rPr>
+          <w:spacing w:val="-2"/>
+          <w:sz w:val="16"/>
+        </w:rPr>
+      </w:r>
+      <w:r>
+        <w:rPr>
+          <w:sz w:val="16"/>
+        </w:rPr>
       </w:r>
       <w:r>
         <w:rPr>
           <w:spacing w:val="-1"/>
           <w:sz w:val="16"/>
         </w:rPr>
-        <w:t> </w:t>
-      </w:r>
-      <w:r>
-        <w:rPr>
-          <w:sz w:val="16"/>
-        </w:rPr>
-        <w:t>external anomaly by construction). Conventional models assume the attacker</w:t>
+      </w:r>
+      <w:r>
+        <w:rPr>
+          <w:sz w:val="16"/>
+        </w:rPr>
       </w:r>
       <w:r>
         <w:rPr>
           <w:spacing w:val="-1"/>
           <w:sz w:val="16"/>
         </w:rPr>
-        <w:t> </w:t>
-      </w:r>
-      <w:r>
-        <w:rPr>
-          <w:sz w:val="16"/>
-        </w:rPr>
-        <w:t>is not</w:t>
-      </w:r>
-      <w:r>
-        <w:rPr>
-          <w:spacing w:val="-2"/>
-          <w:sz w:val="16"/>
-        </w:rPr>
-        <w:t> </w:t>
-      </w:r>
-      <w:r>
-        <w:rPr>
-          <w:sz w:val="16"/>
-        </w:rPr>
-        <w:t>the</w:t>
+      </w:r>
+      <w:r>
+        <w:rPr>
+          <w:sz w:val="16"/>
+        </w:rPr>
+      </w:r>
+      <w:r>
+        <w:rPr>
+          <w:spacing w:val="-2"/>
+          <w:sz w:val="16"/>
+        </w:rPr>
+      </w:r>
+      <w:r>
+        <w:rPr>
+          <w:sz w:val="16"/>
+        </w:rPr>
       </w:r>
       <w:r>
         <w:rPr>
           <w:spacing w:val="-1"/>
           <w:sz w:val="16"/>
         </w:rPr>
-        <w:t> </w:t>
-      </w:r>
-      <w:r>
-        <w:rPr>
-          <w:sz w:val="16"/>
-        </w:rPr>
-        <w:t>customer. In</w:t>
+      </w:r>
+      <w:r>
+        <w:rPr>
+          <w:sz w:val="16"/>
+        </w:rPr>
       </w:r>
       <w:r>
         <w:rPr>
           <w:spacing w:val="-1"/>
           <w:sz w:val="16"/>
         </w:rPr>
-        <w:t> </w:t>
-      </w:r>
-      <w:r>
-        <w:rPr>
-          <w:sz w:val="16"/>
-        </w:rPr>
-        <w:t>a scam-induced</w:t>
+      </w:r>
+      <w:r>
+        <w:rPr>
+          <w:sz w:val="16"/>
+        </w:rPr>
       </w:r>
       <w:r>
         <w:rPr>
           <w:spacing w:val="-3"/>
           <w:sz w:val="16"/>
         </w:rPr>
-        <w:t> </w:t>
-      </w:r>
-      <w:r>
-        <w:rPr>
-          <w:sz w:val="16"/>
-        </w:rPr>
-        <w:t>payment, everything is genuine</w:t>
+      </w:r>
+      <w:r>
+        <w:rPr>
+          <w:sz w:val="16"/>
+        </w:rPr>
       </w:r>
       <w:r>
         <w:rPr>
           <w:spacing w:val="-1"/>
           <w:sz w:val="16"/>
         </w:rPr>
-        <w:t> </w:t>
-      </w:r>
-      <w:r>
-        <w:rPr>
-          <w:sz w:val="16"/>
-        </w:rPr>
-        <w:t>except</w:t>
-      </w:r>
-      <w:r>
-        <w:rPr>
-          <w:spacing w:val="-2"/>
-          <w:sz w:val="16"/>
-        </w:rPr>
-        <w:t> </w:t>
-      </w:r>
-      <w:r>
-        <w:rPr>
-          <w:sz w:val="16"/>
-        </w:rPr>
-        <w:t>the</w:t>
+      </w:r>
+      <w:r>
+        <w:rPr>
+          <w:sz w:val="16"/>
+        </w:rPr>
+      </w:r>
+      <w:r>
+        <w:rPr>
+          <w:spacing w:val="-2"/>
+          <w:sz w:val="16"/>
+        </w:rPr>
+      </w:r>
+      <w:r>
+        <w:rPr>
+          <w:sz w:val="16"/>
+        </w:rPr>
       </w:r>
       <w:r>
         <w:rPr>
           <w:spacing w:val="-1"/>
           <w:sz w:val="16"/>
         </w:rPr>
-        <w:t> </w:t>
-      </w:r>
-      <w:r>
-        <w:rPr>
-          <w:sz w:val="16"/>
-        </w:rPr>
-        <w:t>intent,</w:t>
-      </w:r>
-      <w:r>
-        <w:rPr>
-          <w:spacing w:val="-2"/>
-          <w:sz w:val="16"/>
-        </w:rPr>
-        <w:t> </w:t>
-      </w:r>
-      <w:r>
-        <w:rPr>
-          <w:sz w:val="16"/>
-        </w:rPr>
-        <w:t>and intent</w:t>
-      </w:r>
-      <w:r>
-        <w:rPr>
-          <w:spacing w:val="-2"/>
-          <w:sz w:val="16"/>
-        </w:rPr>
-        <w:t> </w:t>
-      </w:r>
-      <w:r>
-        <w:rPr>
-          <w:sz w:val="16"/>
-        </w:rPr>
-        <w:t>does not</w:t>
-      </w:r>
-      <w:r>
-        <w:rPr>
-          <w:spacing w:val="-2"/>
-          <w:sz w:val="16"/>
-        </w:rPr>
-        <w:t> </w:t>
-      </w:r>
-      <w:r>
-        <w:rPr>
-          <w:sz w:val="16"/>
-        </w:rPr>
-        <w:t>appear</w:t>
+      </w:r>
+      <w:r>
+        <w:rPr>
+          <w:sz w:val="16"/>
+        </w:rPr>
+      </w:r>
+      <w:r>
+        <w:rPr>
+          <w:spacing w:val="-2"/>
+          <w:sz w:val="16"/>
+        </w:rPr>
+      </w:r>
+      <w:r>
+        <w:rPr>
+          <w:sz w:val="16"/>
+        </w:rPr>
+      </w:r>
+      <w:r>
+        <w:rPr>
+          <w:spacing w:val="-2"/>
+          <w:sz w:val="16"/>
+        </w:rPr>
+      </w:r>
+      <w:r>
+        <w:rPr>
+          <w:sz w:val="16"/>
+        </w:rPr>
+      </w:r>
+      <w:r>
+        <w:rPr>
+          <w:spacing w:val="-2"/>
+          <w:sz w:val="16"/>
+        </w:rPr>
+      </w:r>
+      <w:r>
+        <w:rPr>
+          <w:sz w:val="16"/>
+        </w:rPr>
       </w:r>
       <w:r>
         <w:rPr>
           <w:spacing w:val="-1"/>
           <w:sz w:val="16"/>
         </w:rPr>
-        <w:t> </w:t>
-      </w:r>
-      <w:r>
-        <w:rPr>
-          <w:sz w:val="16"/>
-        </w:rPr>
-        <w:t>in any standard column.</w:t>
+      </w:r>
+      <w:r>
+        <w:rPr>
+          <w:sz w:val="16"/>
+        </w:rPr>
       </w:r>
     </w:p>
     <w:p>
@@ -10844,8 +10768,6 @@
         <w:ind w:left="309" w:right="0" w:hanging="309"/>
         <w:jc w:val="left"/>
       </w:pPr>
-      <w:bookmarkStart w:name="4. Generate: Attack Simulation Engine" w:id="3"/>
-      <w:bookmarkEnd w:id="3"/>
       <w:r>
         <w:rPr>
           <w:b w:val="0"/>
@@ -11109,8 +11031,6 @@
         <w:ind w:left="309" w:right="0" w:hanging="309"/>
         <w:jc w:val="left"/>
       </w:pPr>
-      <w:bookmarkStart w:name="5. Defend &amp; 6. Experimental Setup" w:id="4"/>
-      <w:bookmarkEnd w:id="4"/>
       <w:r>
         <w:rPr>
           <w:b w:val="0"/>
@@ -11505,7 +11425,7 @@
         <w:sectPr>
           <w:type w:val="continuous"/>
           <w:pgSz w:w="12240" w:h="15840"/>
-          <w:pgMar w:top="1420" w:bottom="280" w:left="1440" w:right="1080"/>
+          <w:pgMar w:top="1080" w:bottom="1080" w:left="1080" w:right="1080"/>
         </w:sectPr>
       </w:pPr>
     </w:p>
@@ -12237,8 +12157,6 @@
         <w:ind w:left="309" w:right="0" w:hanging="309"/>
         <w:jc w:val="left"/>
       </w:pPr>
-      <w:bookmarkStart w:name="7. Results" w:id="5"/>
-      <w:bookmarkEnd w:id="5"/>
       <w:r>
         <w:rPr>
           <w:b w:val="0"/>
@@ -14493,8 +14411,6 @@
         <w:ind w:left="309" w:right="0" w:hanging="309"/>
         <w:jc w:val="left"/>
       </w:pPr>
-      <w:bookmarkStart w:name="8. Ablations &amp; Error Analysis" w:id="6"/>
-      <w:bookmarkEnd w:id="6"/>
       <w:r>
         <w:rPr>
           <w:b w:val="0"/>
@@ -15255,7 +15171,7 @@
         </w:rPr>
         <w:sectPr>
           <w:pgSz w:w="12240" w:h="15840"/>
-          <w:pgMar w:top="1360" w:bottom="280" w:left="1440" w:right="1080"/>
+          <w:pgMar w:top="1080" w:bottom="1080" w:left="1080" w:right="1080"/>
         </w:sectPr>
       </w:pPr>
     </w:p>
@@ -15961,8 +15877,6 @@
         <w:ind w:left="309" w:right="0" w:hanging="309"/>
         <w:jc w:val="left"/>
       </w:pPr>
-      <w:bookmarkStart w:name="9. Closed-Loop Red/Blue Team System" w:id="7"/>
-      <w:bookmarkEnd w:id="7"/>
       <w:r>
         <w:rPr>
           <w:b w:val="0"/>
@@ -17047,8 +16961,6 @@
         <w:ind w:left="454" w:right="0" w:hanging="454"/>
         <w:jc w:val="left"/>
       </w:pPr>
-      <w:bookmarkStart w:name="10. Real-World Deployment &amp; Feasibility" w:id="8"/>
-      <w:bookmarkEnd w:id="8"/>
       <w:r>
         <w:rPr>
           <w:b w:val="0"/>
@@ -17918,8 +17830,6 @@
         <w:ind w:left="454" w:right="0" w:hanging="454"/>
         <w:jc w:val="left"/>
       </w:pPr>
-      <w:bookmarkStart w:name="11. Working Prototype" w:id="9"/>
-      <w:bookmarkEnd w:id="9"/>
       <w:r>
         <w:rPr>
           <w:b w:val="0"/>
@@ -18188,7 +18098,7 @@
         </w:rPr>
         <w:sectPr>
           <w:pgSz w:w="12240" w:h="15840"/>
-          <w:pgMar w:top="1360" w:bottom="280" w:left="1440" w:right="1080"/>
+          <w:pgMar w:top="1080" w:bottom="1080" w:left="1080" w:right="1080"/>
         </w:sectPr>
       </w:pPr>
     </w:p>
@@ -19047,7 +18957,7 @@
         <w:rPr>
           <w:sz w:val="17"/>
         </w:rPr>
-        <w:t>Two working feedback mechanisms (Section 9) are backed by real before-and-after numbers from an actual retrain, not just a description of what the system is meant to do.</w:t>
+        <w:t>Two working feedback mechanisms (Section 9), backed by real before-and-after numbers from an actual retrain.</w:t>
       </w:r>
       <w:r>
         <w:rPr>
@@ -19172,7 +19082,7 @@
           <w:b/>
           <w:sz w:val="17"/>
         </w:rPr>
-        <w:t>A</w:t>
+        <w:t xml:space="preserve">A safety gate that can catch its own failures. </w:t>
       </w:r>
       <w:r>
         <w:rPr>
@@ -19180,14 +19090,12 @@
           <w:spacing w:val="-2"/>
           <w:sz w:val="17"/>
         </w:rPr>
-        <w:t> </w:t>
       </w:r>
       <w:r>
         <w:rPr>
           <w:b/>
           <w:sz w:val="17"/>
         </w:rPr>
-        <w:t>safety</w:t>
       </w:r>
       <w:r>
         <w:rPr>
@@ -19195,14 +19103,12 @@
           <w:spacing w:val="-5"/>
           <w:sz w:val="17"/>
         </w:rPr>
-        <w:t> </w:t>
       </w:r>
       <w:r>
         <w:rPr>
           <w:b/>
           <w:sz w:val="17"/>
         </w:rPr>
-        <w:t>gate</w:t>
       </w:r>
       <w:r>
         <w:rPr>
@@ -19210,14 +19116,12 @@
           <w:spacing w:val="-7"/>
           <w:sz w:val="17"/>
         </w:rPr>
-        <w:t> </w:t>
       </w:r>
       <w:r>
         <w:rPr>
           <w:b/>
           <w:sz w:val="17"/>
         </w:rPr>
-        <w:t>that</w:t>
       </w:r>
       <w:r>
         <w:rPr>
@@ -19225,14 +19129,12 @@
           <w:spacing w:val="-1"/>
           <w:sz w:val="17"/>
         </w:rPr>
-        <w:t> </w:t>
       </w:r>
       <w:r>
         <w:rPr>
           <w:b/>
           <w:sz w:val="17"/>
         </w:rPr>
-        <w:t>can</w:t>
       </w:r>
       <w:r>
         <w:rPr>
@@ -19240,14 +19142,12 @@
           <w:spacing w:val="-4"/>
           <w:sz w:val="17"/>
         </w:rPr>
-        <w:t> </w:t>
       </w:r>
       <w:r>
         <w:rPr>
           <w:b/>
           <w:sz w:val="17"/>
         </w:rPr>
-        <w:t>catch</w:t>
       </w:r>
       <w:r>
         <w:rPr>
@@ -19255,14 +19155,12 @@
           <w:spacing w:val="-5"/>
           <w:sz w:val="17"/>
         </w:rPr>
-        <w:t> </w:t>
       </w:r>
       <w:r>
         <w:rPr>
           <w:b/>
           <w:sz w:val="17"/>
         </w:rPr>
-        <w:t>its</w:t>
       </w:r>
       <w:r>
         <w:rPr>
@@ -19270,14 +19168,12 @@
           <w:spacing w:val="-2"/>
           <w:sz w:val="17"/>
         </w:rPr>
-        <w:t> </w:t>
       </w:r>
       <w:r>
         <w:rPr>
           <w:b/>
           <w:sz w:val="17"/>
         </w:rPr>
-        <w:t>own</w:t>
       </w:r>
       <w:r>
         <w:rPr>
@@ -19285,105 +19181,90 @@
           <w:spacing w:val="-4"/>
           <w:sz w:val="17"/>
         </w:rPr>
-        <w:t> </w:t>
       </w:r>
       <w:r>
         <w:rPr>
           <w:b/>
           <w:sz w:val="17"/>
         </w:rPr>
-        <w:t>failures. </w:t>
-      </w:r>
-      <w:r>
-        <w:rPr>
-          <w:sz w:val="17"/>
-        </w:rPr>
-        <w:t>cross_generation_eval.py</w:t>
-      </w:r>
-      <w:r>
-        <w:rPr>
-          <w:spacing w:val="-2"/>
-          <w:sz w:val="17"/>
-        </w:rPr>
-        <w:t> </w:t>
-      </w:r>
-      <w:r>
-        <w:rPr>
-          <w:sz w:val="17"/>
-        </w:rPr>
-        <w:t>caught</w:t>
+      </w:r>
+      <w:r>
+        <w:rPr>
+          <w:sz w:val="17"/>
+        </w:rPr>
+        <w:t>cross_generation_eval.py caught a real 34.4%→43.1% regression, found the cause, and confirmed the fix. This validation gate fired for real during the 18-day deadline, not just in theory.</w:t>
+      </w:r>
+      <w:r>
+        <w:rPr>
+          <w:spacing w:val="-2"/>
+          <w:sz w:val="17"/>
+        </w:rPr>
+      </w:r>
+      <w:r>
+        <w:rPr>
+          <w:sz w:val="17"/>
+        </w:rPr>
       </w:r>
       <w:r>
         <w:rPr>
           <w:spacing w:val="-1"/>
           <w:sz w:val="17"/>
         </w:rPr>
-        <w:t> </w:t>
-      </w:r>
-      <w:r>
-        <w:rPr>
-          <w:sz w:val="17"/>
-        </w:rPr>
-        <w:t>a</w:t>
+      </w:r>
+      <w:r>
+        <w:rPr>
+          <w:sz w:val="17"/>
+        </w:rPr>
       </w:r>
       <w:r>
         <w:rPr>
           <w:spacing w:val="-3"/>
           <w:sz w:val="17"/>
         </w:rPr>
-        <w:t> </w:t>
-      </w:r>
-      <w:r>
-        <w:rPr>
-          <w:sz w:val="17"/>
-        </w:rPr>
-        <w:t>real</w:t>
+      </w:r>
+      <w:r>
+        <w:rPr>
+          <w:sz w:val="17"/>
+        </w:rPr>
       </w:r>
       <w:r>
         <w:rPr>
           <w:spacing w:val="-4"/>
           <w:sz w:val="17"/>
         </w:rPr>
-        <w:t> </w:t>
-      </w:r>
-      <w:r>
-        <w:rPr>
-          <w:sz w:val="17"/>
-        </w:rPr>
-        <w:t>34.4%</w:t>
+      </w:r>
+      <w:r>
+        <w:rPr>
+          <w:sz w:val="17"/>
+        </w:rPr>
       </w:r>
       <w:r>
         <w:rPr>
           <w:rFonts w:ascii="Microsoft Sans Serif" w:hAnsi="Microsoft Sans Serif"/>
           <w:sz w:val="17"/>
         </w:rPr>
-        <w:t>→</w:t>
-      </w:r>
-      <w:r>
-        <w:rPr>
-          <w:sz w:val="17"/>
-        </w:rPr>
-        <w:t>43.1%</w:t>
+      </w:r>
+      <w:r>
+        <w:rPr>
+          <w:sz w:val="17"/>
+        </w:rPr>
       </w:r>
       <w:r>
         <w:rPr>
           <w:spacing w:val="-6"/>
           <w:sz w:val="17"/>
         </w:rPr>
-        <w:t> </w:t>
-      </w:r>
-      <w:r>
-        <w:rPr>
-          <w:sz w:val="17"/>
-        </w:rPr>
-        <w:t>regression, the root cause was identified, and the fix was independently re-verified. This is a validation gate that actually fired during the 18-day deadline, demonstrating that the system could detect and correct its own training </w:t>
-      </w:r>
-      <w:r>
-        <w:rPr>
-          <w:spacing w:val="-2"/>
-          <w:sz w:val="17"/>
-        </w:rPr>
-        <w:t>regressions.</w:t>
+      </w:r>
+      <w:r>
+        <w:rPr>
+          <w:sz w:val="17"/>
+        </w:rPr>
+      </w:r>
+      <w:r>
+        <w:rPr>
+          <w:spacing w:val="-2"/>
+          <w:sz w:val="17"/>
+        </w:rPr>
       </w:r>
     </w:p>
     <w:p>
@@ -19415,7 +19296,7 @@
         <w:rPr>
           <w:sz w:val="17"/>
         </w:rPr>
-        <w:t>The 16 families come from a systematic trust-anchor derivation process, using the verification ladder and the inversion pass, not from brainstormed ideas. The catalogue also checks its own research through the evidence pass in Section 3, instead of treating the first draft as correct.</w:t>
+        <w:t>The 16 families come from a systematic trust-anchor process (the verification ladder, the inversion pass), not brainstormed ideas. The catalogue also checks its own research in Section 3, instead of treating the first draft as correct.</w:t>
       </w:r>
       <w:r>
         <w:rPr>
@@ -19701,7 +19582,7 @@
         <w:rPr>
           <w:sz w:val="17"/>
         </w:rPr>
-        <w:t>The team red-teamed its own live inference API (Section 10), found a genuine model-extraction weakness, and fixed a live CORS bug on the spot. The same testing mindset used for the curriculum safety gates was applied to the deployed prototype itself.</w:t>
+        <w:t>The team red-teamed its own live inference API (Section 10), found a genuine model-extraction weakness, and fixed a live CORS bug on the spot.</w:t>
       </w:r>
       <w:r>
         <w:rPr>
@@ -19830,208 +19711,178 @@
           <w:b/>
           <w:sz w:val="17"/>
         </w:rPr>
-        <w:t>Lookalike fidelity. </w:t>
-      </w:r>
-      <w:r>
-        <w:rPr>
-          <w:sz w:val="17"/>
-        </w:rPr>
-        <w:t>The current lookalike-fidelity evaluation shows a </w:t>
+        <w:t xml:space="preserve">Lookalike fidelity. </w:t>
+      </w:r>
+      <w:r>
+        <w:rPr>
+          <w:sz w:val="17"/>
+        </w:rPr>
+        <w:t>The current evaluation shows a 2.12× separation ratio against the 1.0× target. The cause is known: synthetic pre-history is not yet threaded through campaign generation. The real fix needs a re-architecture, deliberately left for after submission.</w:t>
       </w:r>
       <w:r>
         <w:rPr>
           <w:b/>
           <w:sz w:val="17"/>
         </w:rPr>
-        <w:t>2.12× separation ratio </w:t>
-      </w:r>
-      <w:r>
-        <w:rPr>
-          <w:sz w:val="17"/>
-        </w:rPr>
-        <w:t>against</w:t>
+      </w:r>
+      <w:r>
+        <w:rPr>
+          <w:sz w:val="17"/>
+        </w:rPr>
       </w:r>
       <w:r>
         <w:rPr>
           <w:spacing w:val="-1"/>
           <w:sz w:val="17"/>
         </w:rPr>
-        <w:t> </w:t>
-      </w:r>
-      <w:r>
-        <w:rPr>
-          <w:sz w:val="17"/>
-        </w:rPr>
-        <w:t>the </w:t>
+      </w:r>
+      <w:r>
+        <w:rPr>
+          <w:sz w:val="17"/>
+        </w:rPr>
       </w:r>
       <w:r>
         <w:rPr>
           <w:b/>
           <w:sz w:val="17"/>
         </w:rPr>
-        <w:t>1.0× target. </w:t>
-      </w:r>
-      <w:r>
-        <w:rPr>
-          <w:sz w:val="17"/>
-        </w:rPr>
-        <w:t>The root cause has been identified. Synthetic pre-history is not yet sufficiently threaded through the campaign-generation</w:t>
-      </w:r>
-      <w:r>
-        <w:rPr>
-          <w:spacing w:val="-2"/>
-          <w:sz w:val="17"/>
-        </w:rPr>
-        <w:t> </w:t>
-      </w:r>
-      <w:r>
-        <w:rPr>
-          <w:sz w:val="17"/>
-        </w:rPr>
-        <w:t>logic.</w:t>
+      </w:r>
+      <w:r>
+        <w:rPr>
+          <w:sz w:val="17"/>
+        </w:rPr>
+      </w:r>
+      <w:r>
+        <w:rPr>
+          <w:spacing w:val="-2"/>
+          <w:sz w:val="17"/>
+        </w:rPr>
+      </w:r>
+      <w:r>
+        <w:rPr>
+          <w:sz w:val="17"/>
+        </w:rPr>
       </w:r>
       <w:r>
         <w:rPr>
           <w:spacing w:val="-1"/>
           <w:sz w:val="17"/>
         </w:rPr>
-        <w:t> </w:t>
-      </w:r>
-      <w:r>
-        <w:rPr>
-          <w:sz w:val="17"/>
-        </w:rPr>
-        <w:t>Addressing</w:t>
+      </w:r>
+      <w:r>
+        <w:rPr>
+          <w:sz w:val="17"/>
+        </w:rPr>
       </w:r>
       <w:r>
         <w:rPr>
           <w:spacing w:val="-9"/>
           <w:sz w:val="17"/>
         </w:rPr>
-        <w:t> </w:t>
-      </w:r>
-      <w:r>
-        <w:rPr>
-          <w:sz w:val="17"/>
-        </w:rPr>
-        <w:t>this</w:t>
+      </w:r>
+      <w:r>
+        <w:rPr>
+          <w:sz w:val="17"/>
+        </w:rPr>
       </w:r>
       <w:r>
         <w:rPr>
           <w:spacing w:val="-3"/>
           <w:sz w:val="17"/>
         </w:rPr>
-        <w:t> </w:t>
-      </w:r>
-      <w:r>
-        <w:rPr>
-          <w:sz w:val="17"/>
-        </w:rPr>
-        <w:t>properly</w:t>
+      </w:r>
+      <w:r>
+        <w:rPr>
+          <w:sz w:val="17"/>
+        </w:rPr>
       </w:r>
       <w:r>
         <w:rPr>
           <w:spacing w:val="-3"/>
           <w:sz w:val="17"/>
         </w:rPr>
-        <w:t> </w:t>
-      </w:r>
-      <w:r>
-        <w:rPr>
-          <w:sz w:val="17"/>
-        </w:rPr>
-        <w:t>requires</w:t>
+      </w:r>
+      <w:r>
+        <w:rPr>
+          <w:sz w:val="17"/>
+        </w:rPr>
       </w:r>
       <w:r>
         <w:rPr>
           <w:spacing w:val="-3"/>
           <w:sz w:val="17"/>
         </w:rPr>
-        <w:t> </w:t>
-      </w:r>
-      <w:r>
-        <w:rPr>
-          <w:sz w:val="17"/>
-        </w:rPr>
-        <w:t>a</w:t>
+      </w:r>
+      <w:r>
+        <w:rPr>
+          <w:sz w:val="17"/>
+        </w:rPr>
       </w:r>
       <w:r>
         <w:rPr>
           <w:spacing w:val="-3"/>
           <w:sz w:val="17"/>
         </w:rPr>
-        <w:t> </w:t>
-      </w:r>
-      <w:r>
-        <w:rPr>
-          <w:sz w:val="17"/>
-        </w:rPr>
-        <w:t>re-architecture</w:t>
-      </w:r>
-      <w:r>
-        <w:rPr>
-          <w:spacing w:val="-2"/>
-          <w:sz w:val="17"/>
-        </w:rPr>
-        <w:t> </w:t>
-      </w:r>
-      <w:r>
-        <w:rPr>
-          <w:sz w:val="17"/>
-        </w:rPr>
-        <w:t>rather</w:t>
+      </w:r>
+      <w:r>
+        <w:rPr>
+          <w:sz w:val="17"/>
+        </w:rPr>
+      </w:r>
+      <w:r>
+        <w:rPr>
+          <w:spacing w:val="-2"/>
+          <w:sz w:val="17"/>
+        </w:rPr>
+      </w:r>
+      <w:r>
+        <w:rPr>
+          <w:sz w:val="17"/>
+        </w:rPr>
       </w:r>
       <w:r>
         <w:rPr>
           <w:spacing w:val="-5"/>
           <w:sz w:val="17"/>
         </w:rPr>
-        <w:t> </w:t>
-      </w:r>
-      <w:r>
-        <w:rPr>
-          <w:sz w:val="17"/>
-        </w:rPr>
-        <w:t>than</w:t>
-      </w:r>
-      <w:r>
-        <w:rPr>
-          <w:spacing w:val="-2"/>
-          <w:sz w:val="17"/>
-        </w:rPr>
-        <w:t> </w:t>
-      </w:r>
-      <w:r>
-        <w:rPr>
-          <w:sz w:val="17"/>
-        </w:rPr>
-        <w:t>a</w:t>
+      </w:r>
+      <w:r>
+        <w:rPr>
+          <w:sz w:val="17"/>
+        </w:rPr>
+      </w:r>
+      <w:r>
+        <w:rPr>
+          <w:spacing w:val="-2"/>
+          <w:sz w:val="17"/>
+        </w:rPr>
+      </w:r>
+      <w:r>
+        <w:rPr>
+          <w:sz w:val="17"/>
+        </w:rPr>
       </w:r>
       <w:r>
         <w:rPr>
           <w:spacing w:val="-3"/>
           <w:sz w:val="17"/>
         </w:rPr>
-        <w:t> </w:t>
-      </w:r>
-      <w:r>
-        <w:rPr>
-          <w:sz w:val="17"/>
-        </w:rPr>
-        <w:t>simple</w:t>
-      </w:r>
-      <w:r>
-        <w:rPr>
-          <w:spacing w:val="-2"/>
-          <w:sz w:val="17"/>
-        </w:rPr>
-        <w:t> </w:t>
-      </w:r>
-      <w:r>
-        <w:rPr>
-          <w:sz w:val="17"/>
-        </w:rPr>
-        <w:t>parameter adjustment, so it was deliberately deferred instead of introducing an untested change close to submission.</w:t>
+      </w:r>
+      <w:r>
+        <w:rPr>
+          <w:sz w:val="17"/>
+        </w:rPr>
+      </w:r>
+      <w:r>
+        <w:rPr>
+          <w:spacing w:val="-2"/>
+          <w:sz w:val="17"/>
+        </w:rPr>
+      </w:r>
+      <w:r>
+        <w:rPr>
+          <w:sz w:val="17"/>
+        </w:rPr>
       </w:r>
     </w:p>
     <w:p>
@@ -20089,7 +19940,7 @@
         <w:rPr>
           <w:sz w:val="17"/>
         </w:rPr>
-        <w:t>A campaign that keeps the payer's out-degree looking normal can still get past the current detection logic. Today it scores just 0.02% fraud probability, so it is almost always missed. The next iteration should fix this through class-weighted retraining and more explicit network-level features.</w:t>
+        <w:t>A campaign that keeps the payer's out-degree looking normal still gets past detection, scoring just 0.02% fraud probability. The fix is class-weighted retraining and more explicit network-level features.</w:t>
       </w:r>
       <w:r>
         <w:rPr>
@@ -20275,7 +20126,7 @@
           <w:b/>
           <w:sz w:val="17"/>
         </w:rPr>
-        <w:t>Structurally</w:t>
+        <w:t xml:space="preserve">Structurally undetectable families. </w:t>
       </w:r>
       <w:r>
         <w:rPr>
@@ -20283,14 +20134,12 @@
           <w:spacing w:val="-8"/>
           <w:sz w:val="17"/>
         </w:rPr>
-        <w:t> </w:t>
       </w:r>
       <w:r>
         <w:rPr>
           <w:b/>
           <w:sz w:val="17"/>
         </w:rPr>
-        <w:t>undetectable</w:t>
       </w:r>
       <w:r>
         <w:rPr>
@@ -20298,14 +20147,12 @@
           <w:spacing w:val="-5"/>
           <w:sz w:val="17"/>
         </w:rPr>
-        <w:t> </w:t>
       </w:r>
       <w:r>
         <w:rPr>
           <w:b/>
           <w:sz w:val="17"/>
         </w:rPr>
-        <w:t>families.</w:t>
       </w:r>
       <w:r>
         <w:rPr>
@@ -20313,208 +20160,177 @@
           <w:spacing w:val="-2"/>
           <w:sz w:val="17"/>
         </w:rPr>
-        <w:t> </w:t>
-      </w:r>
-      <w:r>
-        <w:rPr>
-          <w:sz w:val="17"/>
-        </w:rPr>
-        <w:t>Attack</w:t>
+      </w:r>
+      <w:r>
+        <w:rPr>
+          <w:sz w:val="17"/>
+        </w:rPr>
+        <w:t>first_party_dispute, stealth_mandate, device_fan_out, and balance_drain_exit all depend on cross-transaction or post-settlement information a stateless model cannot see. This is a genuine boundary of the current detector, not a tuning problem.</w:t>
       </w:r>
       <w:r>
         <w:rPr>
           <w:spacing w:val="-7"/>
           <w:sz w:val="17"/>
         </w:rPr>
-        <w:t> </w:t>
-      </w:r>
-      <w:r>
-        <w:rPr>
-          <w:sz w:val="17"/>
-        </w:rPr>
-        <w:t>types</w:t>
+      </w:r>
+      <w:r>
+        <w:rPr>
+          <w:sz w:val="17"/>
+        </w:rPr>
       </w:r>
       <w:r>
         <w:rPr>
           <w:spacing w:val="-6"/>
           <w:sz w:val="17"/>
         </w:rPr>
-        <w:t> </w:t>
-      </w:r>
-      <w:r>
-        <w:rPr>
-          <w:sz w:val="17"/>
-        </w:rPr>
-        <w:t>such</w:t>
+      </w:r>
+      <w:r>
+        <w:rPr>
+          <w:sz w:val="17"/>
+        </w:rPr>
       </w:r>
       <w:r>
         <w:rPr>
           <w:spacing w:val="-5"/>
           <w:sz w:val="17"/>
         </w:rPr>
-        <w:t> </w:t>
-      </w:r>
-      <w:r>
-        <w:rPr>
-          <w:sz w:val="17"/>
-        </w:rPr>
-        <w:t>as</w:t>
+      </w:r>
+      <w:r>
+        <w:rPr>
+          <w:sz w:val="17"/>
+        </w:rPr>
       </w:r>
       <w:r>
         <w:rPr>
           <w:spacing w:val="-6"/>
           <w:sz w:val="17"/>
         </w:rPr>
-        <w:t> </w:t>
-      </w:r>
-      <w:r>
-        <w:rPr>
-          <w:sz w:val="17"/>
-        </w:rPr>
-        <w:t>first_party_dispute,</w:t>
+      </w:r>
+      <w:r>
+        <w:rPr>
+          <w:sz w:val="17"/>
+        </w:rPr>
       </w:r>
       <w:r>
         <w:rPr>
           <w:spacing w:val="-4"/>
           <w:sz w:val="17"/>
         </w:rPr>
-        <w:t> </w:t>
-      </w:r>
-      <w:r>
-        <w:rPr>
-          <w:sz w:val="17"/>
-        </w:rPr>
-        <w:t>stealth_mandate,</w:t>
+      </w:r>
+      <w:r>
+        <w:rPr>
+          <w:sz w:val="17"/>
+        </w:rPr>
       </w:r>
       <w:r>
         <w:rPr>
           <w:spacing w:val="-4"/>
           <w:sz w:val="17"/>
         </w:rPr>
-        <w:t> </w:t>
-      </w:r>
-      <w:r>
-        <w:rPr>
-          <w:sz w:val="17"/>
-        </w:rPr>
-        <w:t>device_fan_out, and</w:t>
-      </w:r>
-      <w:r>
-        <w:rPr>
-          <w:spacing w:val="-2"/>
-          <w:sz w:val="17"/>
-        </w:rPr>
-        <w:t> </w:t>
-      </w:r>
-      <w:r>
-        <w:rPr>
-          <w:sz w:val="17"/>
-        </w:rPr>
-        <w:t>balance_drain_exit depend</w:t>
-      </w:r>
-      <w:r>
-        <w:rPr>
-          <w:spacing w:val="-2"/>
-          <w:sz w:val="17"/>
-        </w:rPr>
-        <w:t> </w:t>
-      </w:r>
-      <w:r>
-        <w:rPr>
-          <w:sz w:val="17"/>
-        </w:rPr>
-        <w:t>on</w:t>
+      </w:r>
+      <w:r>
+        <w:rPr>
+          <w:sz w:val="17"/>
+        </w:rPr>
+      </w:r>
+      <w:r>
+        <w:rPr>
+          <w:spacing w:val="-2"/>
+          <w:sz w:val="17"/>
+        </w:rPr>
+      </w:r>
+      <w:r>
+        <w:rPr>
+          <w:sz w:val="17"/>
+        </w:rPr>
+      </w:r>
+      <w:r>
+        <w:rPr>
+          <w:spacing w:val="-2"/>
+          <w:sz w:val="17"/>
+        </w:rPr>
+      </w:r>
+      <w:r>
+        <w:rPr>
+          <w:sz w:val="17"/>
+        </w:rPr>
       </w:r>
       <w:r>
         <w:rPr>
           <w:spacing w:val="-1"/>
           <w:sz w:val="17"/>
         </w:rPr>
-        <w:t> </w:t>
-      </w:r>
-      <w:r>
-        <w:rPr>
-          <w:sz w:val="17"/>
-        </w:rPr>
-        <w:t>cross-transaction</w:t>
+      </w:r>
+      <w:r>
+        <w:rPr>
+          <w:sz w:val="17"/>
+        </w:rPr>
       </w:r>
       <w:r>
         <w:rPr>
           <w:spacing w:val="-1"/>
           <w:sz w:val="17"/>
         </w:rPr>
-        <w:t> </w:t>
-      </w:r>
-      <w:r>
-        <w:rPr>
-          <w:sz w:val="17"/>
-        </w:rPr>
-        <w:t>or</w:t>
+      </w:r>
+      <w:r>
+        <w:rPr>
+          <w:sz w:val="17"/>
+        </w:rPr>
       </w:r>
       <w:r>
         <w:rPr>
           <w:spacing w:val="-4"/>
           <w:sz w:val="17"/>
         </w:rPr>
-        <w:t> </w:t>
-      </w:r>
-      <w:r>
-        <w:rPr>
-          <w:sz w:val="17"/>
-        </w:rPr>
-        <w:t>post-settlement information</w:t>
+      </w:r>
+      <w:r>
+        <w:rPr>
+          <w:sz w:val="17"/>
+        </w:rPr>
       </w:r>
       <w:r>
         <w:rPr>
           <w:spacing w:val="-1"/>
           <w:sz w:val="17"/>
         </w:rPr>
-        <w:t> </w:t>
-      </w:r>
-      <w:r>
-        <w:rPr>
-          <w:sz w:val="17"/>
-        </w:rPr>
-        <w:t>that a</w:t>
-      </w:r>
-      <w:r>
-        <w:rPr>
-          <w:spacing w:val="-2"/>
-          <w:sz w:val="17"/>
-        </w:rPr>
-        <w:t> </w:t>
-      </w:r>
-      <w:r>
-        <w:rPr>
-          <w:sz w:val="17"/>
-        </w:rPr>
-        <w:t>stateless</w:t>
+      </w:r>
+      <w:r>
+        <w:rPr>
+          <w:sz w:val="17"/>
+        </w:rPr>
+      </w:r>
+      <w:r>
+        <w:rPr>
+          <w:spacing w:val="-2"/>
+          <w:sz w:val="17"/>
+        </w:rPr>
+      </w:r>
+      <w:r>
+        <w:rPr>
+          <w:sz w:val="17"/>
+        </w:rPr>
       </w:r>
       <w:r>
         <w:rPr>
           <w:spacing w:val="-7"/>
           <w:sz w:val="17"/>
         </w:rPr>
-        <w:t> </w:t>
-      </w:r>
-      <w:r>
-        <w:rPr>
-          <w:sz w:val="17"/>
-        </w:rPr>
-        <w:t>transaction-level model cannot observe. These cases require temporal, graph,</w:t>
+      </w:r>
+      <w:r>
+        <w:rPr>
+          <w:sz w:val="17"/>
+        </w:rPr>
       </w:r>
       <w:r>
         <w:rPr>
           <w:spacing w:val="-1"/>
           <w:sz w:val="17"/>
         </w:rPr>
-        <w:t> </w:t>
-      </w:r>
-      <w:r>
-        <w:rPr>
-          <w:sz w:val="17"/>
-        </w:rPr>
-        <w:t>or post-settlement signals, so they represent a genuine boundary of the current detector rather than a simple model-tuning problem.</w:t>
+      </w:r>
+      <w:r>
+        <w:rPr>
+          <w:sz w:val="17"/>
+        </w:rPr>
       </w:r>
     </w:p>
     <w:p>
@@ -20540,202 +20356,173 @@
           <w:b/>
           <w:sz w:val="17"/>
         </w:rPr>
-        <w:t>AutoPay dark-pattern renewal. </w:t>
-      </w:r>
-      <w:r>
-        <w:rPr>
-          <w:sz w:val="17"/>
-        </w:rPr>
-        <w:t>A realistic GenAI-era attack involving an LLM-generated mandate-renewal message that obscures an extension was identified during the research phase but was not implemented. Properly</w:t>
+        <w:t xml:space="preserve">AutoPay dark-pattern renewal. </w:t>
+      </w:r>
+      <w:r>
+        <w:rPr>
+          <w:sz w:val="17"/>
+        </w:rPr>
+        <w:t>A GenAI-era attack using a mandate-renewal message that hides an extension, identified in research but not implemented. Kept as a documented finding, not a weakly-grounded build.</w:t>
       </w:r>
       <w:r>
         <w:rPr>
           <w:spacing w:val="-3"/>
           <w:sz w:val="17"/>
         </w:rPr>
-        <w:t> </w:t>
-      </w:r>
-      <w:r>
-        <w:rPr>
-          <w:sz w:val="17"/>
-        </w:rPr>
-        <w:t>modelling</w:t>
+      </w:r>
+      <w:r>
+        <w:rPr>
+          <w:sz w:val="17"/>
+        </w:rPr>
       </w:r>
       <w:r>
         <w:rPr>
           <w:spacing w:val="-4"/>
           <w:sz w:val="17"/>
         </w:rPr>
-        <w:t> </w:t>
-      </w:r>
-      <w:r>
-        <w:rPr>
-          <w:sz w:val="17"/>
-        </w:rPr>
-        <w:t>this</w:t>
+      </w:r>
+      <w:r>
+        <w:rPr>
+          <w:sz w:val="17"/>
+        </w:rPr>
       </w:r>
       <w:r>
         <w:rPr>
           <w:spacing w:val="-3"/>
           <w:sz w:val="17"/>
         </w:rPr>
-        <w:t> </w:t>
-      </w:r>
-      <w:r>
-        <w:rPr>
-          <w:sz w:val="17"/>
-        </w:rPr>
-        <w:t>attack</w:t>
+      </w:r>
+      <w:r>
+        <w:rPr>
+          <w:sz w:val="17"/>
+        </w:rPr>
       </w:r>
       <w:r>
         <w:rPr>
           <w:spacing w:val="-4"/>
           <w:sz w:val="17"/>
         </w:rPr>
-        <w:t> </w:t>
-      </w:r>
-      <w:r>
-        <w:rPr>
-          <w:sz w:val="17"/>
-        </w:rPr>
-        <w:t>would</w:t>
+      </w:r>
+      <w:r>
+        <w:rPr>
+          <w:sz w:val="17"/>
+        </w:rPr>
       </w:r>
       <w:r>
         <w:rPr>
           <w:spacing w:val="-4"/>
           <w:sz w:val="17"/>
         </w:rPr>
-        <w:t> </w:t>
-      </w:r>
-      <w:r>
-        <w:rPr>
-          <w:sz w:val="17"/>
-        </w:rPr>
-        <w:t>require</w:t>
-      </w:r>
-      <w:r>
-        <w:rPr>
-          <w:spacing w:val="-2"/>
-          <w:sz w:val="17"/>
-        </w:rPr>
-        <w:t> </w:t>
-      </w:r>
-      <w:r>
-        <w:rPr>
-          <w:sz w:val="17"/>
-        </w:rPr>
-        <w:t>either</w:t>
+      </w:r>
+      <w:r>
+        <w:rPr>
+          <w:sz w:val="17"/>
+        </w:rPr>
+      </w:r>
+      <w:r>
+        <w:rPr>
+          <w:spacing w:val="-2"/>
+          <w:sz w:val="17"/>
+        </w:rPr>
+      </w:r>
+      <w:r>
+        <w:rPr>
+          <w:sz w:val="17"/>
+        </w:rPr>
       </w:r>
       <w:r>
         <w:rPr>
           <w:spacing w:val="-5"/>
           <w:sz w:val="17"/>
         </w:rPr>
-        <w:t> </w:t>
-      </w:r>
-      <w:r>
-        <w:rPr>
-          <w:sz w:val="17"/>
-        </w:rPr>
-        <w:t>realistic</w:t>
+      </w:r>
+      <w:r>
+        <w:rPr>
+          <w:sz w:val="17"/>
+        </w:rPr>
       </w:r>
       <w:r>
         <w:rPr>
           <w:spacing w:val="-3"/>
           <w:sz w:val="17"/>
         </w:rPr>
-        <w:t> </w:t>
-      </w:r>
-      <w:r>
-        <w:rPr>
-          <w:sz w:val="17"/>
-        </w:rPr>
-        <w:t>consent-UI</w:t>
+      </w:r>
+      <w:r>
+        <w:rPr>
+          <w:sz w:val="17"/>
+        </w:rPr>
       </w:r>
       <w:r>
         <w:rPr>
           <w:spacing w:val="-1"/>
           <w:sz w:val="17"/>
         </w:rPr>
-        <w:t> </w:t>
-      </w:r>
-      <w:r>
-        <w:rPr>
-          <w:sz w:val="17"/>
-        </w:rPr>
-        <w:t>copy</w:t>
-      </w:r>
-      <w:r>
-        <w:rPr>
-          <w:spacing w:val="-2"/>
-          <w:sz w:val="17"/>
-        </w:rPr>
-        <w:t> </w:t>
-      </w:r>
-      <w:r>
-        <w:rPr>
-          <w:sz w:val="17"/>
-        </w:rPr>
-        <w:t>or</w:t>
+      </w:r>
+      <w:r>
+        <w:rPr>
+          <w:sz w:val="17"/>
+        </w:rPr>
+      </w:r>
+      <w:r>
+        <w:rPr>
+          <w:spacing w:val="-2"/>
+          <w:sz w:val="17"/>
+        </w:rPr>
+      </w:r>
+      <w:r>
+        <w:rPr>
+          <w:sz w:val="17"/>
+        </w:rPr>
       </w:r>
       <w:r>
         <w:rPr>
           <w:spacing w:val="-5"/>
           <w:sz w:val="17"/>
         </w:rPr>
-        <w:t> </w:t>
-      </w:r>
-      <w:r>
-        <w:rPr>
-          <w:sz w:val="17"/>
-        </w:rPr>
-        <w:t>a</w:t>
-      </w:r>
-      <w:r>
-        <w:rPr>
-          <w:spacing w:val="-2"/>
-          <w:sz w:val="17"/>
-        </w:rPr>
-        <w:t> </w:t>
-      </w:r>
-      <w:r>
-        <w:rPr>
-          <w:sz w:val="17"/>
-        </w:rPr>
-        <w:t>defensible</w:t>
-      </w:r>
-      <w:r>
-        <w:rPr>
-          <w:spacing w:val="-2"/>
-          <w:sz w:val="17"/>
-        </w:rPr>
-        <w:t> </w:t>
-      </w:r>
-      <w:r>
-        <w:rPr>
-          <w:sz w:val="17"/>
-        </w:rPr>
-        <w:t>disclosure-clarity signal. Rather than fabricate such a signal, the attack was kept as</w:t>
+      </w:r>
+      <w:r>
+        <w:rPr>
+          <w:sz w:val="17"/>
+        </w:rPr>
+      </w:r>
+      <w:r>
+        <w:rPr>
+          <w:spacing w:val="-2"/>
+          <w:sz w:val="17"/>
+        </w:rPr>
+      </w:r>
+      <w:r>
+        <w:rPr>
+          <w:sz w:val="17"/>
+        </w:rPr>
+      </w:r>
+      <w:r>
+        <w:rPr>
+          <w:spacing w:val="-2"/>
+          <w:sz w:val="17"/>
+        </w:rPr>
+      </w:r>
+      <w:r>
+        <w:rPr>
+          <w:sz w:val="17"/>
+        </w:rPr>
       </w:r>
       <w:r>
         <w:rPr>
           <w:spacing w:val="-3"/>
           <w:sz w:val="17"/>
         </w:rPr>
-        <w:t> </w:t>
-      </w:r>
-      <w:r>
-        <w:rPr>
-          <w:sz w:val="17"/>
-        </w:rPr>
-        <w:t>a documented research finding and future </w:t>
-      </w:r>
-      <w:r>
-        <w:rPr>
-          <w:spacing w:val="-2"/>
-          <w:sz w:val="17"/>
-        </w:rPr>
-        <w:t>extension.</w:t>
+      </w:r>
+      <w:r>
+        <w:rPr>
+          <w:sz w:val="17"/>
+        </w:rPr>
+      </w:r>
+      <w:r>
+        <w:rPr>
+          <w:spacing w:val="-2"/>
+          <w:sz w:val="17"/>
+        </w:rPr>
       </w:r>
     </w:p>
     <w:p>
@@ -20783,197 +20570,159 @@
       </w:pPr>
       <w:r>
         <w:rPr/>
-        <w:t>Chakravyuh addresses the brief's central concern that when the same team plays both attacker and defender, the resulting number may prove very little. It does</w:t>
+        <w:t>Chakravyuh treats the brief's central risk, one team building both attacker and defender, as something to test, not assume away. Attacks are derived systematically and checked against real sources in Section 3. When the generator's own numbers looked too good, three real leaks were found and fixed, not accepted at face value, in Section 4. The detector reaches 0.9987 test PR-AUC and 100% recall on the held-out family in Section 7, but the lookalike-fidelity check missed its own target in Section 4, so that result is an upper bound, not a calibrated estimate.</w:t>
       </w:r>
       <w:r>
         <w:rPr>
           <w:spacing w:val="-1"/>
         </w:rPr>
-        <w:t> </w:t>
       </w:r>
       <w:r>
         <w:rPr/>
-        <w:t>this by making every stage capable of failing and then measuring what happens when it does. Attacks are derived systematically and checked against real sources in Section 3. When the generator's</w:t>
-      </w:r>
-      <w:r>
-        <w:rPr>
-          <w:spacing w:val="-2"/>
-        </w:rPr>
-        <w:t> </w:t>
+      </w:r>
+      <w:r>
+        <w:rPr>
+          <w:spacing w:val="-2"/>
+        </w:rPr>
       </w:r>
       <w:r>
         <w:rPr/>
-        <w:t>own</w:t>
-      </w:r>
-      <w:r>
-        <w:rPr>
-          <w:spacing w:val="-2"/>
-        </w:rPr>
-        <w:t> </w:t>
+      </w:r>
+      <w:r>
+        <w:rPr>
+          <w:spacing w:val="-2"/>
+        </w:rPr>
       </w:r>
       <w:r>
         <w:rPr/>
-        <w:t>numbers</w:t>
-      </w:r>
-      <w:r>
-        <w:rPr>
-          <w:spacing w:val="-2"/>
-        </w:rPr>
-        <w:t> </w:t>
+      </w:r>
+      <w:r>
+        <w:rPr>
+          <w:spacing w:val="-2"/>
+        </w:rPr>
       </w:r>
       <w:r>
         <w:rPr/>
-        <w:t>looked</w:t>
       </w:r>
       <w:r>
         <w:rPr>
           <w:spacing w:val="-3"/>
         </w:rPr>
-        <w:t> </w:t>
       </w:r>
       <w:r>
         <w:rPr/>
-        <w:t>too</w:t>
       </w:r>
       <w:r>
         <w:rPr>
           <w:spacing w:val="-4"/>
         </w:rPr>
-        <w:t> </w:t>
       </w:r>
       <w:r>
         <w:rPr/>
-        <w:t>good,</w:t>
       </w:r>
       <w:r>
         <w:rPr>
           <w:spacing w:val="-1"/>
         </w:rPr>
-        <w:t> </w:t>
       </w:r>
       <w:r>
         <w:rPr/>
-        <w:t>they</w:t>
-      </w:r>
-      <w:r>
-        <w:rPr>
-          <w:spacing w:val="-2"/>
-        </w:rPr>
-        <w:t> </w:t>
+      </w:r>
+      <w:r>
+        <w:rPr>
+          <w:spacing w:val="-2"/>
+        </w:rPr>
       </w:r>
       <w:r>
         <w:rPr/>
-        <w:t>were</w:t>
-      </w:r>
-      <w:r>
-        <w:rPr>
-          <w:spacing w:val="-2"/>
-        </w:rPr>
-        <w:t> </w:t>
+      </w:r>
+      <w:r>
+        <w:rPr>
+          <w:spacing w:val="-2"/>
+        </w:rPr>
       </w:r>
       <w:r>
         <w:rPr/>
-        <w:t>investigated,</w:t>
       </w:r>
       <w:r>
         <w:rPr>
           <w:spacing w:val="-5"/>
         </w:rPr>
-        <w:t> </w:t>
       </w:r>
       <w:r>
         <w:rPr/>
-        <w:t>and</w:t>
-      </w:r>
-      <w:r>
-        <w:rPr>
-          <w:spacing w:val="-2"/>
-        </w:rPr>
-        <w:t> </w:t>
+      </w:r>
+      <w:r>
+        <w:rPr>
+          <w:spacing w:val="-2"/>
+        </w:rPr>
       </w:r>
       <w:r>
         <w:rPr/>
-        <w:t>three</w:t>
-      </w:r>
-      <w:r>
-        <w:rPr>
-          <w:spacing w:val="-2"/>
-        </w:rPr>
-        <w:t> </w:t>
+      </w:r>
+      <w:r>
+        <w:rPr>
+          <w:spacing w:val="-2"/>
+        </w:rPr>
       </w:r>
       <w:r>
         <w:rPr/>
-        <w:t>real</w:t>
       </w:r>
       <w:r>
         <w:rPr>
           <w:spacing w:val="-3"/>
         </w:rPr>
-        <w:t> </w:t>
       </w:r>
       <w:r>
         <w:rPr/>
-        <w:t>leaks</w:t>
-      </w:r>
-      <w:r>
-        <w:rPr>
-          <w:spacing w:val="-2"/>
-        </w:rPr>
-        <w:t> </w:t>
+      </w:r>
+      <w:r>
+        <w:rPr>
+          <w:spacing w:val="-2"/>
+        </w:rPr>
       </w:r>
       <w:r>
         <w:rPr/>
-        <w:t>were</w:t>
       </w:r>
       <w:r>
         <w:rPr>
           <w:spacing w:val="-6"/>
         </w:rPr>
-        <w:t> </w:t>
       </w:r>
       <w:r>
         <w:rPr/>
-        <w:t>found</w:t>
-      </w:r>
-      <w:r>
-        <w:rPr>
-          <w:spacing w:val="-2"/>
-        </w:rPr>
-        <w:t> </w:t>
+      </w:r>
+      <w:r>
+        <w:rPr>
+          <w:spacing w:val="-2"/>
+        </w:rPr>
       </w:r>
       <w:r>
         <w:rPr/>
-        <w:t>and</w:t>
       </w:r>
       <w:r>
         <w:rPr>
           <w:spacing w:val="-3"/>
         </w:rPr>
-        <w:t> </w:t>
       </w:r>
       <w:r>
         <w:rPr/>
-        <w:t>fixed</w:t>
-      </w:r>
-      <w:r>
-        <w:rPr>
-          <w:spacing w:val="-2"/>
-        </w:rPr>
-        <w:t> </w:t>
+      </w:r>
+      <w:r>
+        <w:rPr>
+          <w:spacing w:val="-2"/>
+        </w:rPr>
       </w:r>
       <w:r>
         <w:rPr/>
-        <w:t>rather</w:t>
       </w:r>
       <w:r>
         <w:rPr>
           <w:spacing w:val="-4"/>
         </w:rPr>
-        <w:t> </w:t>
       </w:r>
       <w:r>
         <w:rPr/>
-        <w:t>than</w:t>
       </w:r>
     </w:p>
     <w:p>
@@ -20982,270 +20731,9 @@
         <w:spacing w:after="0" w:line="280" w:lineRule="auto"/>
         <w:sectPr>
           <w:pgSz w:w="12240" w:h="15840"/>
-          <w:pgMar w:top="1360" w:bottom="280" w:left="1440" w:right="1080"/>
+          <w:pgMar w:top="1080" w:bottom="1080" w:left="1080" w:right="1080"/>
         </w:sectPr>
       </w:pPr>
-    </w:p>
-    <w:p>
-      <w:pPr>
-        <w:pStyle w:val="BodyText"/>
-        <w:spacing w:line="280" w:lineRule="auto" w:before="81"/>
-        <w:ind w:right="384"/>
-      </w:pPr>
-      <w:r>
-        <w:rPr/>
-        <w:t>accepted at</w:t>
-      </w:r>
-      <w:r>
-        <w:rPr>
-          <w:spacing w:val="-1"/>
-        </w:rPr>
-        <w:t> </w:t>
-      </w:r>
-      <w:r>
-        <w:rPr/>
-        <w:t>face value</w:t>
-      </w:r>
-      <w:r>
-        <w:rPr>
-          <w:spacing w:val="-2"/>
-        </w:rPr>
-        <w:t> </w:t>
-      </w:r>
-      <w:r>
-        <w:rPr/>
-        <w:t>in Section 4. The detector reaches 0.9987</w:t>
-      </w:r>
-      <w:r>
-        <w:rPr>
-          <w:spacing w:val="-3"/>
-        </w:rPr>
-        <w:t> </w:t>
-      </w:r>
-      <w:r>
-        <w:rPr/>
-        <w:t>test PR-AUC</w:t>
-      </w:r>
-      <w:r>
-        <w:rPr>
-          <w:spacing w:val="-1"/>
-        </w:rPr>
-        <w:t> </w:t>
-      </w:r>
-      <w:r>
-        <w:rPr/>
-        <w:t>and 100%</w:t>
-      </w:r>
-      <w:r>
-        <w:rPr>
-          <w:spacing w:val="-1"/>
-        </w:rPr>
-        <w:t> </w:t>
-      </w:r>
-      <w:r>
-        <w:rPr/>
-        <w:t>recall on the held-out family in Section</w:t>
-      </w:r>
-      <w:r>
-        <w:rPr>
-          <w:spacing w:val="-2"/>
-        </w:rPr>
-        <w:t> </w:t>
-      </w:r>
-      <w:r>
-        <w:rPr/>
-        <w:t>7.</w:t>
-      </w:r>
-      <w:r>
-        <w:rPr>
-          <w:spacing w:val="-1"/>
-        </w:rPr>
-        <w:t> </w:t>
-      </w:r>
-      <w:r>
-        <w:rPr/>
-        <w:t>At</w:t>
-      </w:r>
-      <w:r>
-        <w:rPr>
-          <w:spacing w:val="-2"/>
-        </w:rPr>
-        <w:t> </w:t>
-      </w:r>
-      <w:r>
-        <w:rPr/>
-        <w:t>the</w:t>
-      </w:r>
-      <w:r>
-        <w:rPr>
-          <w:spacing w:val="-2"/>
-        </w:rPr>
-        <w:t> </w:t>
-      </w:r>
-      <w:r>
-        <w:rPr/>
-        <w:t>same</w:t>
-      </w:r>
-      <w:r>
-        <w:rPr>
-          <w:spacing w:val="-7"/>
-        </w:rPr>
-        <w:t> </w:t>
-      </w:r>
-      <w:r>
-        <w:rPr/>
-        <w:t>time,</w:t>
-      </w:r>
-      <w:r>
-        <w:rPr>
-          <w:spacing w:val="-1"/>
-        </w:rPr>
-        <w:t> </w:t>
-      </w:r>
-      <w:r>
-        <w:rPr/>
-        <w:t>the</w:t>
-      </w:r>
-      <w:r>
-        <w:rPr>
-          <w:spacing w:val="-2"/>
-        </w:rPr>
-        <w:t> </w:t>
-      </w:r>
-      <w:r>
-        <w:rPr/>
-        <w:t>document</w:t>
-      </w:r>
-      <w:r>
-        <w:rPr>
-          <w:spacing w:val="-1"/>
-        </w:rPr>
-        <w:t> </w:t>
-      </w:r>
-      <w:r>
-        <w:rPr/>
-        <w:t>is</w:t>
-      </w:r>
-      <w:r>
-        <w:rPr>
-          <w:spacing w:val="-3"/>
-        </w:rPr>
-        <w:t> </w:t>
-      </w:r>
-      <w:r>
-        <w:rPr/>
-        <w:t>explicit</w:t>
-      </w:r>
-      <w:r>
-        <w:rPr>
-          <w:spacing w:val="-1"/>
-        </w:rPr>
-        <w:t> </w:t>
-      </w:r>
-      <w:r>
-        <w:rPr/>
-        <w:t>that</w:t>
-      </w:r>
-      <w:r>
-        <w:rPr>
-          <w:spacing w:val="-6"/>
-        </w:rPr>
-        <w:t> </w:t>
-      </w:r>
-      <w:r>
-        <w:rPr/>
-        <w:t>the</w:t>
-      </w:r>
-      <w:r>
-        <w:rPr>
-          <w:spacing w:val="-2"/>
-        </w:rPr>
-        <w:t> </w:t>
-      </w:r>
-      <w:r>
-        <w:rPr/>
-        <w:t>lookalike-fidelity</w:t>
-      </w:r>
-      <w:r>
-        <w:rPr>
-          <w:spacing w:val="-3"/>
-        </w:rPr>
-        <w:t> </w:t>
-      </w:r>
-      <w:r>
-        <w:rPr/>
-        <w:t>check</w:t>
-      </w:r>
-      <w:r>
-        <w:rPr>
-          <w:spacing w:val="-4"/>
-        </w:rPr>
-        <w:t> </w:t>
-      </w:r>
-      <w:r>
-        <w:rPr/>
-        <w:t>missed</w:t>
-      </w:r>
-      <w:r>
-        <w:rPr>
-          <w:spacing w:val="-3"/>
-        </w:rPr>
-        <w:t> </w:t>
-      </w:r>
-      <w:r>
-        <w:rPr/>
-        <w:t>its</w:t>
-      </w:r>
-      <w:r>
-        <w:rPr>
-          <w:spacing w:val="-3"/>
-        </w:rPr>
-        <w:t> </w:t>
-      </w:r>
-      <w:r>
-        <w:rPr/>
-        <w:t>own</w:t>
-      </w:r>
-      <w:r>
-        <w:rPr>
-          <w:spacing w:val="-2"/>
-        </w:rPr>
-        <w:t> </w:t>
-      </w:r>
-      <w:r>
-        <w:rPr/>
-        <w:t>target</w:t>
-      </w:r>
-      <w:r>
-        <w:rPr>
-          <w:spacing w:val="-1"/>
-        </w:rPr>
-        <w:t> </w:t>
-      </w:r>
-      <w:r>
-        <w:rPr/>
-        <w:t>in</w:t>
-      </w:r>
-      <w:r>
-        <w:rPr>
-          <w:spacing w:val="-2"/>
-        </w:rPr>
-        <w:t> </w:t>
-      </w:r>
-      <w:r>
-        <w:rPr/>
-        <w:t>Section</w:t>
-      </w:r>
-      <w:r>
-        <w:rPr>
-          <w:spacing w:val="-2"/>
-        </w:rPr>
-        <w:t> </w:t>
-      </w:r>
-      <w:r>
-        <w:rPr/>
-        <w:t>4 and that the resulting performance should be interpreted as an upper bound rather than a calibrated estimate.</w:t>
-      </w:r>
     </w:p>
     <w:p>
       <w:pPr>
@@ -21261,7 +20749,7 @@
       </w:pPr>
       <w:r>
         <w:rPr/>
-        <w:t>The closed loop is measured, not just shown in a diagram. It includes a live feature-importance feedback path and a 3-generation curriculum, with a safety check that caught a real regression (evasion rose from 34.4% to 43.1%) during development and confirmed it was fixed in Section 9. Real-world feasibility is demonstrated through a working, deployed prototype with sub-millisecond CPU-only inference, along with a concrete production roadmap covering a real-time feature store, mule-network retraining, and API hardening. These priorities were identified through the system's own instrumentation in Sections 8 and 10.</w:t>
+        <w:t>The closed loop is measured, not just diagrammed: a live feature-importance feedback path, a 3-generation curriculum, and a safety check that caught and fixed a real regression (evasion rose from 34.4% to 43.1%) in Section 9. The prototype runs with sub-millisecond CPU-only inference. What production still needs (a real-time feature store, mule-network retraining, further API hardening) was found through the system's own instrumentation in Sections 8 and 10.</w:t>
       </w:r>
       <w:r>
         <w:rPr>
@@ -21398,170 +20886,10 @@
         <w:spacing w:before="43"/>
       </w:pPr>
     </w:p>
-    <w:p>
-      <w:pPr>
-        <w:pStyle w:val="BodyText"/>
-        <w:spacing w:line="280" w:lineRule="auto"/>
-        <w:ind w:right="404"/>
-      </w:pPr>
-      <w:r>
-        <w:rPr/>
-        <w:t>This is not presented as a finished or perfect system. It is a system designed to test itself as rigorously as it tests simulated</w:t>
-      </w:r>
-      <w:r>
-        <w:rPr>
-          <w:spacing w:val="-2"/>
-        </w:rPr>
-        <w:t> </w:t>
-      </w:r>
-      <w:r>
-        <w:rPr/>
-        <w:t>fraud. Its</w:t>
-      </w:r>
-      <w:r>
-        <w:rPr>
-          <w:spacing w:val="-2"/>
-        </w:rPr>
-        <w:t> </w:t>
-      </w:r>
-      <w:r>
-        <w:rPr/>
-        <w:t>strength</w:t>
-      </w:r>
-      <w:r>
-        <w:rPr>
-          <w:spacing w:val="-1"/>
-        </w:rPr>
-        <w:t> </w:t>
-      </w:r>
-      <w:r>
-        <w:rPr/>
-        <w:t>is</w:t>
-      </w:r>
-      <w:r>
-        <w:rPr>
-          <w:spacing w:val="-7"/>
-        </w:rPr>
-        <w:t> </w:t>
-      </w:r>
-      <w:r>
-        <w:rPr/>
-        <w:t>not that it never</w:t>
-      </w:r>
-      <w:r>
-        <w:rPr>
-          <w:spacing w:val="-4"/>
-        </w:rPr>
-        <w:t> </w:t>
-      </w:r>
-      <w:r>
-        <w:rPr/>
-        <w:t>fails.</w:t>
-      </w:r>
-      <w:r>
-        <w:rPr>
-          <w:spacing w:val="-5"/>
-        </w:rPr>
-        <w:t> </w:t>
-      </w:r>
-      <w:r>
-        <w:rPr/>
-        <w:t>Its</w:t>
-      </w:r>
-      <w:r>
-        <w:rPr>
-          <w:spacing w:val="-2"/>
-        </w:rPr>
-        <w:t> </w:t>
-      </w:r>
-      <w:r>
-        <w:rPr/>
-        <w:t>strength</w:t>
-      </w:r>
-      <w:r>
-        <w:rPr>
-          <w:spacing w:val="-6"/>
-        </w:rPr>
-        <w:t> </w:t>
-      </w:r>
-      <w:r>
-        <w:rPr/>
-        <w:t>is</w:t>
-      </w:r>
-      <w:r>
-        <w:rPr>
-          <w:spacing w:val="-2"/>
-        </w:rPr>
-        <w:t> </w:t>
-      </w:r>
-      <w:r>
-        <w:rPr/>
-        <w:t>that it can</w:t>
-      </w:r>
-      <w:r>
-        <w:rPr>
-          <w:spacing w:val="-1"/>
-        </w:rPr>
-        <w:t> </w:t>
-      </w:r>
-      <w:r>
-        <w:rPr/>
-        <w:t>expose</w:t>
-      </w:r>
-      <w:r>
-        <w:rPr>
-          <w:spacing w:val="-1"/>
-        </w:rPr>
-        <w:t> </w:t>
-      </w:r>
-      <w:r>
-        <w:rPr/>
-        <w:t>its</w:t>
-      </w:r>
-      <w:r>
-        <w:rPr>
-          <w:spacing w:val="-2"/>
-        </w:rPr>
-        <w:t> </w:t>
-      </w:r>
-      <w:r>
-        <w:rPr/>
-        <w:t>own</w:t>
-      </w:r>
-      <w:r>
-        <w:rPr>
-          <w:spacing w:val="-1"/>
-        </w:rPr>
-        <w:t> </w:t>
-      </w:r>
-      <w:r>
-        <w:rPr/>
-        <w:t>weaknesses, trace</w:t>
-      </w:r>
-      <w:r>
-        <w:rPr>
-          <w:spacing w:val="-6"/>
-        </w:rPr>
-        <w:t> </w:t>
-      </w:r>
-      <w:r>
-        <w:rPr/>
-        <w:t>them</w:t>
-      </w:r>
-      <w:r>
-        <w:rPr>
-          <w:spacing w:val="-4"/>
-        </w:rPr>
-        <w:t> </w:t>
-      </w:r>
-      <w:r>
-        <w:rPr/>
-        <w:t>to specific causes, fix what can be fixed, and clearly show what remains.</w:t>
-      </w:r>
-    </w:p>
     <w:sectPr>
+      <w:type w:val="continuous"/>
       <w:pgSz w:w="12240" w:h="15840"/>
-      <w:pgMar w:top="1360" w:bottom="280" w:left="1440" w:right="1080"/>
+      <w:pgMar w:top="1080" w:bottom="1080" w:left="1080" w:right="1080"/>
     </w:sectPr>
   </w:body>
 </w:document>

</xml_diff>

<commit_message>
Fix heading auto-number skip and remaining hidden section breaks
</commit_message>
<xml_diff>
--- a/Chakravyuh.docx
+++ b/Chakravyuh.docx
@@ -7776,6 +7776,7 @@
           <w:sz w:val="13"/>
         </w:rPr>
         <w:sectPr>
+          <w:type w:val="continuous"/>
           <w:pgSz w:w="12240" w:h="15840"/>
           <w:pgMar w:top="1080" w:bottom="1080" w:left="1080" w:right="1080"/>
         </w:sectPr>
@@ -15170,6 +15171,7 @@
           <w:sz w:val="17"/>
         </w:rPr>
         <w:sectPr>
+          <w:type w:val="continuous"/>
           <w:pgSz w:w="12240" w:h="15840"/>
           <w:pgMar w:top="1080" w:bottom="1080" w:left="1080" w:right="1080"/>
         </w:sectPr>
@@ -18097,6 +18099,7 @@
           <w:sz w:val="18"/>
         </w:rPr>
         <w:sectPr>
+          <w:type w:val="continuous"/>
           <w:pgSz w:w="12240" w:h="15840"/>
           <w:pgMar w:top="1080" w:bottom="1080" w:left="1080" w:right="1080"/>
         </w:sectPr>
@@ -20730,6 +20733,7 @@
         <w:pStyle w:val="BodyText"/>
         <w:spacing w:after="0" w:line="280" w:lineRule="auto"/>
         <w:sectPr>
+          <w:type w:val="continuous"/>
           <w:pgSz w:w="12240" w:h="15840"/>
           <w:pgMar w:top="1080" w:bottom="1080" w:left="1080" w:right="1080"/>
         </w:sectPr>
@@ -21028,7 +21032,7 @@
   <w:abstractNum w:abstractNumId="2">
     <w:multiLevelType w:val="hybridMultilevel"/>
     <w:lvl w:ilvl="0">
-      <w:start w:val="7"/>
+      <w:start w:val="6"/>
       <w:numFmt w:val="decimal"/>
       <w:lvlText w:val="%1."/>
       <w:lvlJc w:val="left"/>

</xml_diff>